<commit_message>
Refine open-ended interview wording and role-specific probes for review
</commit_message>
<xml_diff>
--- a/public/internal/interview-outline/materials/题库审定/汽车定性访谈题库措辞审阅稿.docx
+++ b/public/internal/interview-outline/materials/题库审定/汽车定性访谈题库措辞审阅稿.docx
@@ -56,7 +56,7 @@
         <w:rPr>
           <w:rFonts w:ascii="Source Han Sans SC" w:hAnsi="Source Han Sans SC" w:eastAsia="Source Han Sans SC"/>
         </w:rPr>
-        <w:t>先让受访者自由回答，再按需追问；区分实际经历、他人反馈和未来预期。事实金额核对时间、币种和所含费用。专业受访者依据其职责及直接接触的信息回答。</w:t>
+        <w:t>先让受访者自由回答，再按需追问；先还原具体经历和行为，再追问感受、原因与取舍，不预设问题、情绪或答案。区分实际经历、他人反馈和未来预期。事实金额核对时间、币种和所含费用。专业受访者依据其职责及直接接触的信息回答。</w:t>
       </w:r>
     </w:p>
     <w:p>
@@ -300,7 +300,7 @@
         <w:rPr>
           <w:rFonts w:ascii="Source Han Sans SC" w:hAnsi="Source Han Sans SC" w:eastAsia="Source Han Sans SC"/>
         </w:rPr>
-        <w:t>还有什么重要情况没有谈到？如果只留下三条建议，您最希望我们记住什么？</w:t>
+        <w:t>还有哪些重要情况没有谈到？</w:t>
       </w:r>
     </w:p>
     <w:p>
@@ -337,7 +337,7 @@
         <w:rPr>
           <w:rFonts w:ascii="Source Han Sans SC" w:hAnsi="Source Han Sans SC" w:eastAsia="Source Han Sans SC"/>
         </w:rPr>
-        <w:t>尚未讨论的重要内容；最需要优先关注的建议。</w:t>
+        <w:t>尚未讨论的重要内容；其中最需要优先关注的是什么？。</w:t>
       </w:r>
     </w:p>
     <w:p>
@@ -1069,7 +1069,7 @@
         <w:rPr>
           <w:rFonts w:ascii="Source Han Sans SC" w:hAnsi="Source Han Sans SC" w:eastAsia="Source Han Sans SC"/>
         </w:rPr>
-        <w:t>适合的人群与用途；与其他车型类别的差异；功能与社会印象。</w:t>
+        <w:t>适合的人群与用途；与其他车型类别的差异；您觉得这类车给人什么印象？哪些地方让您有这种感觉？。</w:t>
       </w:r>
     </w:p>
     <w:p>
@@ -1461,7 +1461,7 @@
         <w:rPr>
           <w:rFonts w:ascii="Source Han Sans SC" w:hAnsi="Source Han Sans SC" w:eastAsia="Source Han Sans SC"/>
         </w:rPr>
-        <w:t>请回顾不常发生但对您重要的实际出行。未来购车时，您希望车辆满足哪些相关需要？</w:t>
+        <w:t>请讲一次不常发生、但对您重要的实际出行，当时是怎样安排的？</w:t>
       </w:r>
     </w:p>
     <w:p>
@@ -1479,7 +1479,7 @@
         <w:rPr>
           <w:rFonts w:ascii="Source Han Sans SC" w:hAnsi="Source Han Sans SC" w:eastAsia="Source Han Sans SC"/>
         </w:rPr>
-        <w:t>具体任务、人员和时间要求；行程的重要之处；需要车辆提供的支持。</w:t>
+        <w:t>具体任务、人员和时间要求；行程的重要之处；车辆提供的支持；意向者：这次经历让您对未来买车有哪些要求？。</w:t>
       </w:r>
     </w:p>
     <w:p>
@@ -2142,7 +2142,7 @@
         <w:rPr>
           <w:rFonts w:ascii="Source Han Sans SC" w:hAnsi="Source Han Sans SC" w:eastAsia="Source Han Sans SC"/>
         </w:rPr>
-        <w:t>请回顾一次炎热或日晒后用车的经历，从上车到行驶介绍当时的感受。</w:t>
+        <w:t>请回顾一次天气很热或车辆晒过太阳后用车的经历，从走近车辆到出发，您通常会做些什么？</w:t>
       </w:r>
     </w:p>
     <w:p>
@@ -2161,7 +2161,7 @@
         <w:rPr>
           <w:rFonts w:ascii="Source Han Sans SC" w:hAnsi="Source Han Sans SC" w:eastAsia="Source Han Sans SC"/>
         </w:rPr>
-        <w:t>请回顾一次炎热或日晒后出行的经历，从上车到行驶介绍当时的感受。</w:t>
+        <w:t>请回顾一次天气很热或车辆晒过太阳后乘车的经历，从走近车辆到出发，您做了些什么？</w:t>
       </w:r>
     </w:p>
     <w:p>
@@ -2179,7 +2179,7 @@
         <w:rPr>
           <w:rFonts w:ascii="Source Han Sans SC" w:hAnsi="Source Han Sans SC" w:eastAsia="Source Han Sans SC"/>
         </w:rPr>
-        <w:t>日晒后的车内感受；空调降温时间；前后排差异。</w:t>
+        <w:t>上车前后的动作与感受；空调降温过程；前后排差异；希望改善的方面。</w:t>
       </w:r>
     </w:p>
     <w:p>
@@ -2249,7 +2249,7 @@
         <w:rPr>
           <w:rFonts w:ascii="Source Han Sans SC" w:hAnsi="Source Han Sans SC" w:eastAsia="Source Han Sans SC"/>
         </w:rPr>
-        <w:t>请回顾一次寒冷或冰雪天气的出行经历，再说明希望未来车辆保留或改善的方面。</w:t>
+        <w:t>请回顾一次寒冷或冰雪天气的出行经历，当时是怎样安排的？</w:t>
       </w:r>
     </w:p>
     <w:p>
@@ -2267,7 +2267,7 @@
         <w:rPr>
           <w:rFonts w:ascii="Source Han Sans SC" w:hAnsi="Source Han Sans SC" w:eastAsia="Source Han Sans SC"/>
         </w:rPr>
-        <w:t>制热、除雾与操作；续航和道路条件；对出行的影响及处理。</w:t>
+        <w:t>制热、除雾与操作；续航和道路条件；对出行的影响及处理；对未来车辆的要求。</w:t>
       </w:r>
     </w:p>
     <w:p>
@@ -2467,7 +2467,7 @@
         <w:rPr>
           <w:rFonts w:ascii="Source Han Sans SC" w:hAnsi="Source Han Sans SC" w:eastAsia="Source Han Sans SC"/>
         </w:rPr>
-        <w:t>在实际乘坐过或使用过的车辆里，最常做哪些操作？将来自己的车最需要支持什么？</w:t>
+        <w:t>在您实际开过或坐过的车里，您经常使用哪些功能？请选一次，讲讲操作过程。</w:t>
       </w:r>
     </w:p>
     <w:p>
@@ -2486,7 +2486,7 @@
         <w:rPr>
           <w:rFonts w:ascii="Source Han Sans SC" w:hAnsi="Source Han Sans SC" w:eastAsia="Source Han Sans SC"/>
         </w:rPr>
-        <w:t>最近一次操作的步骤；常用功能和使用频次；操作中的停顿或替代方式。</w:t>
+        <w:t>最近一次操作的步骤；常用功能和使用频次；操作中的停顿或替代方式；意向者：未来的车希望提供哪些功能？。</w:t>
       </w:r>
     </w:p>
     <w:p>
@@ -3042,7 +3042,7 @@
         <w:rPr>
           <w:rFonts w:ascii="Source Han Sans SC" w:hAnsi="Source Han Sans SC" w:eastAsia="Source Han Sans SC"/>
         </w:rPr>
-        <w:t>回顾刚才的实际出行，哪些方面需要改善？请结合一次经历说明。</w:t>
+        <w:t>回顾刚才的实际出行，您希望哪些地方有所改善？请结合一次经历说明。</w:t>
       </w:r>
     </w:p>
     <w:p>
@@ -3061,7 +3061,7 @@
         <w:rPr>
           <w:rFonts w:ascii="Source Han Sans SC" w:hAnsi="Source Han Sans SC" w:eastAsia="Source Han Sans SC"/>
         </w:rPr>
-        <w:t>结合您目前的实际出行，哪些方面需要改善？请举例说明。</w:t>
+        <w:t>结合您目前的实际出行，您希望哪些地方有所改善？请举例说明。</w:t>
       </w:r>
     </w:p>
     <w:p>
@@ -3291,7 +3291,7 @@
         <w:rPr>
           <w:rFonts w:ascii="Source Han Sans SC" w:hAnsi="Source Han Sans SC" w:eastAsia="Source Han Sans SC"/>
         </w:rPr>
-        <w:t>请介绍一个明确期间内的用车费用，以及各项费用如何估算。</w:t>
+        <w:t>以最近一个月为例，您用车大约花了多少钱？主要花在哪些方面？</w:t>
       </w:r>
     </w:p>
     <w:p>
@@ -3578,7 +3578,7 @@
         <w:rPr>
           <w:rFonts w:ascii="Source Han Sans SC" w:hAnsi="Source Han Sans SC" w:eastAsia="Source Han Sans SC"/>
         </w:rPr>
-        <w:t>您实际熟悉的区域，停车、能源或充电或燃料补给条件怎样影响日常出行？</w:t>
+        <w:t>在您经常出行的地方，停车、充电或加油的条件怎么样？对您的出行有什么影响？</w:t>
       </w:r>
     </w:p>
     <w:p>
@@ -3597,7 +3597,7 @@
         <w:rPr>
           <w:rFonts w:ascii="Source Han Sans SC" w:hAnsi="Source Han Sans SC" w:eastAsia="Source Han Sans SC"/>
         </w:rPr>
-        <w:t>您目前能够使用或已确认的停车、能源和充电或燃料补给条件有哪些？哪些还不清楚？</w:t>
+        <w:t>未来买车后，您计划在哪里停车、充电或加油？哪些条件已经确认，哪些还不清楚？</w:t>
       </w:r>
     </w:p>
     <w:p>
@@ -3850,7 +3850,7 @@
         <w:rPr>
           <w:rFonts w:ascii="Source Han Sans SC" w:hAnsi="Source Han Sans SC" w:eastAsia="Source Han Sans SC"/>
         </w:rPr>
-        <w:t>请介绍本次购车预算的确定过程，以及之后的调整情况。</w:t>
+        <w:t>这次买车的预算是怎样确定的？</w:t>
       </w:r>
     </w:p>
     <w:p>
@@ -3869,7 +3869,7 @@
         <w:rPr>
           <w:rFonts w:ascii="Source Han Sans SC" w:hAnsi="Source Han Sans SC" w:eastAsia="Source Han Sans SC"/>
         </w:rPr>
-        <w:t>请介绍目前购车预算的确定过程，以及可能影响预算调整的条件。</w:t>
+        <w:t>目前买车的预算是怎样确定的？</w:t>
       </w:r>
     </w:p>
     <w:p>
@@ -3887,7 +3887,7 @@
         <w:rPr>
           <w:rFonts w:ascii="Source Han Sans SC" w:hAnsi="Source Han Sans SC" w:eastAsia="Source Han Sans SC"/>
         </w:rPr>
-        <w:t>预算参与者；金额、币种和所含费用；预算调整的原因。</w:t>
+        <w:t>预算参与者；金额、币种和所含费用；车主：预算之后有无变化及具体取舍；意向者：可能影响预算的条件。</w:t>
       </w:r>
     </w:p>
     <w:p>
@@ -5296,7 +5296,7 @@
         <w:rPr>
           <w:rFonts w:ascii="Source Han Sans SC" w:hAnsi="Source Han Sans SC" w:eastAsia="Source Han Sans SC"/>
         </w:rPr>
-        <w:t>对不同动力形式的理解；信息来源；先考虑动力还是车型。</w:t>
+        <w:t>对不同动力形式的理解与信息来源；先考虑动力还是车型；实际开过或坐过的不同动力车辆，体验上的差别及对选择的影响。</w:t>
       </w:r>
     </w:p>
     <w:p>
@@ -5772,7 +5772,7 @@
         <w:rPr>
           <w:rFonts w:ascii="Source Han Sans SC" w:hAnsi="Source Han Sans SC" w:eastAsia="Source Han Sans SC"/>
         </w:rPr>
-        <w:t>请介绍您使用过或了解过的交流充电方式，以及它与日常停车时间和出行需要的适合程度。</w:t>
+        <w:t>您使用过或了解过哪些慢充方式？通常怎样安排充电？</w:t>
       </w:r>
     </w:p>
     <w:p>
@@ -5790,7 +5790,7 @@
         <w:rPr>
           <w:rFonts w:ascii="Source Han Sans SC" w:hAnsi="Source Han Sans SC" w:eastAsia="Source Han Sans SC"/>
         </w:rPr>
-        <w:t>停车时间与充电安排；已知的车辆和设施能力；下一次出行所需电量或里程。</w:t>
+        <w:t>停车时间与充电安排；车辆和充电设施的条件；下一次出行所需电量或里程。</w:t>
       </w:r>
     </w:p>
     <w:p>
@@ -6245,6 +6245,25 @@
     <w:p>
       <w:pPr>
         <w:keepNext/>
+        <w:spacing w:after="60"/>
+      </w:pPr>
+      <w:r>
+        <w:rPr>
+          <w:rFonts w:ascii="Source Han Sans SC" w:hAnsi="Source Han Sans SC" w:eastAsia="Source Han Sans SC"/>
+          <w:b/>
+        </w:rPr>
+        <w:t xml:space="preserve">适用或准备  </w:t>
+      </w:r>
+      <w:r>
+        <w:rPr>
+          <w:rFonts w:ascii="Source Han Sans SC" w:hAnsi="Source Han Sans SC" w:eastAsia="Source Han Sans SC"/>
+        </w:rPr>
+        <w:t>有实际使用经历时问经历；未使用过时追问考虑使用的条件。</w:t>
+      </w:r>
+    </w:p>
+    <w:p>
+      <w:pPr>
+        <w:keepNext/>
         <w:spacing w:after="80"/>
       </w:pPr>
       <w:r>
@@ -6258,7 +6277,7 @@
         <w:rPr>
           <w:rFonts w:ascii="Source Han Sans SC" w:hAnsi="Source Han Sans SC" w:eastAsia="Source Han Sans SC"/>
         </w:rPr>
-        <w:t>您会怎样决定使用或停止使用驾驶辅助功能？请结合经历或使用条件说明。</w:t>
+        <w:t>请讲一次您使用驾驶辅助功能的经历，当时怎样决定开启、继续使用或关闭？</w:t>
       </w:r>
     </w:p>
     <w:p>
@@ -6276,7 +6295,7 @@
         <w:rPr>
           <w:rFonts w:ascii="Source Han Sans SC" w:hAnsi="Source Han Sans SC" w:eastAsia="Source Han Sans SC"/>
         </w:rPr>
-        <w:t>功能与驾驶者责任的理解；失误和恢复操控的经历；停止使用的条件。</w:t>
+        <w:t>具体功能、道路条件和使用过程；使用时关注的内容；如有恢复人工操控的经历：当时发生了什么、怎样处理；决定使用或停止使用的原因。</w:t>
       </w:r>
     </w:p>
     <w:p>
@@ -7185,7 +7204,7 @@
         <w:rPr>
           <w:rFonts w:ascii="Source Han Sans SC" w:hAnsi="Source Han Sans SC" w:eastAsia="Source Han Sans SC"/>
         </w:rPr>
-        <w:t>请分别介绍您对这些颜色、材质和表面处理方案的感受，以及它们与您使用需要的关系。</w:t>
+        <w:t>请分别说说这些颜色和材质给您的感受。哪些更适合您的用车需要？为什么？</w:t>
       </w:r>
     </w:p>
     <w:p>
@@ -7334,7 +7353,7 @@
         <w:rPr>
           <w:rFonts w:ascii="Source Han Sans SC" w:hAnsi="Source Han Sans SC" w:eastAsia="Source Han Sans SC"/>
         </w:rPr>
-        <w:t>结合材料中说明的车辆尺寸，以及您常走的路线和停车地点，请介绍这辆车与实际使用条件的适合程度。</w:t>
+        <w:t>结合材料中说明的车辆尺寸，以及您常走的路线和停车地点，这辆车用起来会怎么样？</w:t>
       </w:r>
     </w:p>
     <w:p>
@@ -7836,7 +7855,7 @@
         <w:rPr>
           <w:rFonts w:ascii="Source Han Sans SC" w:hAnsi="Source Han Sans SC" w:eastAsia="Source Han Sans SC"/>
         </w:rPr>
-        <w:t>结合材料说明的车内中央功能区及通道布局，请介绍它们对您使用车辆的影响，以及您的取舍。</w:t>
+        <w:t>看过材料中的车内布局后，您觉得中间这些功能和通道用起来会怎么样？</w:t>
       </w:r>
     </w:p>
     <w:p>
@@ -7854,7 +7873,7 @@
         <w:rPr>
           <w:rFonts w:ascii="Source Han Sans SC" w:hAnsi="Source Han Sans SC" w:eastAsia="Source Han Sans SC"/>
         </w:rPr>
-        <w:t>使用者与频次；功能价值；对车内通行和上下车的影响。</w:t>
+        <w:t>具体使用者、用途与频次；功能的作用；车内走动和上下车的影响；功能与通道空间的取舍。</w:t>
       </w:r>
     </w:p>
     <w:p>
@@ -9761,7 +9780,7 @@
         <w:rPr>
           <w:rFonts w:ascii="Source Han Sans SC" w:hAnsi="Source Han Sans SC" w:eastAsia="Source Han Sans SC"/>
         </w:rPr>
-        <w:t>请介绍这些产品信息中哪些与您最相关，哪些说服力不足，以及原因。</w:t>
+        <w:t>这些产品信息给您什么感觉？哪些与您的需要有关？</w:t>
       </w:r>
     </w:p>
     <w:p>
@@ -9779,7 +9798,7 @@
         <w:rPr>
           <w:rFonts w:ascii="Source Han Sans SC" w:hAnsi="Source Han Sans SC" w:eastAsia="Source Han Sans SC"/>
         </w:rPr>
-        <w:t>优先表达的信息与原因；说服力不足的内容；需要的证据。</w:t>
+        <w:t>与自身需要有关的信息；不清楚或不够可信的内容及原因；还需要了解什么。</w:t>
       </w:r>
     </w:p>
     <w:p>
@@ -10136,7 +10155,7 @@
         <w:rPr>
           <w:rFonts w:ascii="Source Han Sans SC" w:hAnsi="Source Han Sans SC" w:eastAsia="Source Han Sans SC"/>
         </w:rPr>
-        <w:t>请介绍这类汽车近期的销售情况，以及您对未来一至两年的判断和依据。</w:t>
+        <w:t>在您负责的业务中，这类汽车近期的销售情况有哪些变化？</w:t>
       </w:r>
     </w:p>
     <w:p>
@@ -10192,7 +10211,7 @@
         <w:rPr>
           <w:rFonts w:ascii="Source Han Sans SC" w:hAnsi="Source Han Sans SC" w:eastAsia="Source Han Sans SC"/>
         </w:rPr>
-        <w:t>数据来源、期间和单位；实际表现与未来判断；主要假设和不确定因素。</w:t>
+        <w:t>地区、期间、车型和数据来源；经销商：咨询、订单或销量的具体变化及案例；对未来一至两年的判断、依据及主要假设。</w:t>
       </w:r>
     </w:p>
     <w:p>
@@ -14011,6 +14030,25 @@
     <w:p>
       <w:pPr>
         <w:keepNext/>
+        <w:spacing w:after="60"/>
+      </w:pPr>
+      <w:r>
+        <w:rPr>
+          <w:rFonts w:ascii="Source Han Sans SC" w:hAnsi="Source Han Sans SC" w:eastAsia="Source Han Sans SC"/>
+          <w:b/>
+        </w:rPr>
+        <w:t xml:space="preserve">适用或准备  </w:t>
+      </w:r>
+      <w:r>
+        <w:rPr>
+          <w:rFonts w:ascii="Source Han Sans SC" w:hAnsi="Source Han Sans SC" w:eastAsia="Source Han Sans SC"/>
+        </w:rPr>
+        <w:t>有直接参与采购决策或相关安排的经验时选用。</w:t>
+      </w:r>
+    </w:p>
+    <w:p>
+      <w:pPr>
+        <w:keepNext/>
         <w:spacing w:after="80"/>
       </w:pPr>
       <w:r>
@@ -14072,6 +14110,25 @@
     <w:p>
       <w:pPr>
         <w:keepNext/>
+        <w:spacing w:after="60"/>
+      </w:pPr>
+      <w:r>
+        <w:rPr>
+          <w:rFonts w:ascii="Source Han Sans SC" w:hAnsi="Source Han Sans SC" w:eastAsia="Source Han Sans SC"/>
+          <w:b/>
+        </w:rPr>
+        <w:t xml:space="preserve">适用或准备  </w:t>
+      </w:r>
+      <w:r>
+        <w:rPr>
+          <w:rFonts w:ascii="Source Han Sans SC" w:hAnsi="Source Han Sans SC" w:eastAsia="Source Han Sans SC"/>
+        </w:rPr>
+        <w:t>有直接参与采购决策或相关安排的经验时选用。</w:t>
+      </w:r>
+    </w:p>
+    <w:p>
+      <w:pPr>
+        <w:keepNext/>
         <w:spacing w:after="80"/>
       </w:pPr>
       <w:r>
@@ -14133,6 +14190,25 @@
     <w:p>
       <w:pPr>
         <w:keepNext/>
+        <w:spacing w:after="60"/>
+      </w:pPr>
+      <w:r>
+        <w:rPr>
+          <w:rFonts w:ascii="Source Han Sans SC" w:hAnsi="Source Han Sans SC" w:eastAsia="Source Han Sans SC"/>
+          <w:b/>
+        </w:rPr>
+        <w:t xml:space="preserve">适用或准备  </w:t>
+      </w:r>
+      <w:r>
+        <w:rPr>
+          <w:rFonts w:ascii="Source Han Sans SC" w:hAnsi="Source Han Sans SC" w:eastAsia="Source Han Sans SC"/>
+        </w:rPr>
+        <w:t>有直接参与采购决策或相关安排的经验时选用。</w:t>
+      </w:r>
+    </w:p>
+    <w:p>
+      <w:pPr>
+        <w:keepNext/>
         <w:spacing w:after="80"/>
       </w:pPr>
       <w:r>
@@ -14207,7 +14283,7 @@
         <w:rPr>
           <w:rFonts w:ascii="Source Han Sans SC" w:hAnsi="Source Han Sans SC" w:eastAsia="Source Han Sans SC"/>
         </w:rPr>
-        <w:t>仅研究新能源或替代动力时进入充电或燃料补给细节。</w:t>
+        <w:t>有直接参与采购决策或相关安排的经验时选用。仅研究新能源或替代动力时进入充电或燃料补给细节。</w:t>
       </w:r>
     </w:p>
     <w:p>
@@ -14335,6 +14411,25 @@
     <w:p>
       <w:pPr>
         <w:keepNext/>
+        <w:spacing w:after="60"/>
+      </w:pPr>
+      <w:r>
+        <w:rPr>
+          <w:rFonts w:ascii="Source Han Sans SC" w:hAnsi="Source Han Sans SC" w:eastAsia="Source Han Sans SC"/>
+          <w:b/>
+        </w:rPr>
+        <w:t xml:space="preserve">适用或准备  </w:t>
+      </w:r>
+      <w:r>
+        <w:rPr>
+          <w:rFonts w:ascii="Source Han Sans SC" w:hAnsi="Source Han Sans SC" w:eastAsia="Source Han Sans SC"/>
+        </w:rPr>
+        <w:t>有直接参与采购决策或相关安排的经验时选用。</w:t>
+      </w:r>
+    </w:p>
+    <w:p>
+      <w:pPr>
+        <w:keepNext/>
         <w:spacing w:after="80"/>
       </w:pPr>
       <w:r>
@@ -14409,7 +14504,7 @@
         <w:rPr>
           <w:rFonts w:ascii="Source Han Sans SC" w:hAnsi="Source Han Sans SC" w:eastAsia="Source Han Sans SC"/>
         </w:rPr>
-        <w:t>先问自发认知；只有项目组已核验政策名称、对象和有效期后才提示。</w:t>
+        <w:t>有直接参与采购决策或相关安排的经验时选用。先问自发认知；只有项目组已核验政策名称、对象和有效期后才提示。</w:t>
       </w:r>
     </w:p>
     <w:p>

</xml_diff>